<commit_message>
Updated resilience documentation Fixed #1372
git-svn-id: https://sources.ecopath.org/svn/Ecopath/trunk/Ecopath6@11717 a725721c-0ed6-864e-a6a8-02c2a1988c9d
</commit_message>
<xml_diff>
--- a/Sources Internal/Plugins/EwEResiliencePlugin/Resilience/Documentation/EwEResilience.docx
+++ b/Sources Internal/Plugins/EwEResiliencePlugin/Resilience/Documentation/EwEResilience.docx
@@ -84,13 +84,7 @@
         <w:rPr>
           <w:lang w:val="en-US"/>
         </w:rPr>
-        <w:t xml:space="preserve"> </w:t>
-      </w:r>
-      <w:r>
-        <w:rPr>
-          <w:lang w:val="en-US"/>
-        </w:rPr>
-        <w:t>when Ecosim runs</w:t>
+        <w:t xml:space="preserve"> when Ecosim runs</w:t>
       </w:r>
       <w:r>
         <w:rPr>
@@ -129,37 +123,49 @@
         <w:rPr>
           <w:lang w:val="en-US"/>
         </w:rPr>
-        <w:t xml:space="preserve">To </w:t>
-      </w:r>
-      <w:r>
-        <w:rPr>
-          <w:lang w:val="en-US"/>
-        </w:rPr>
-        <w:t>show the Resilience form</w:t>
-      </w:r>
-      <w:r>
-        <w:rPr>
-          <w:lang w:val="en-US"/>
-        </w:rPr>
-        <w:t xml:space="preserve">, navigate to </w:t>
-      </w:r>
-      <w:r>
-        <w:rPr>
-          <w:lang w:val="en-US"/>
-        </w:rPr>
-        <w:t xml:space="preserve">Ecosim &gt; Output &gt; Resilience </w:t>
-      </w:r>
-      <w:r>
-        <w:rPr>
-          <w:lang w:val="en-US"/>
-        </w:rPr>
-        <w:t xml:space="preserve">file </w:t>
-      </w:r>
-      <w:r>
-        <w:rPr>
-          <w:lang w:val="en-US"/>
-        </w:rPr>
-        <w:t>(</w:t>
+        <w:t xml:space="preserve">The plug-in </w:t>
+      </w:r>
+      <w:r>
+        <w:rPr>
+          <w:lang w:val="en-US"/>
+        </w:rPr>
+        <w:t>offers</w:t>
+      </w:r>
+      <w:r>
+        <w:rPr>
+          <w:lang w:val="en-US"/>
+        </w:rPr>
+        <w:t xml:space="preserve"> three screens or forms</w:t>
+      </w:r>
+      <w:r>
+        <w:rPr>
+          <w:lang w:val="en-US"/>
+        </w:rPr>
+        <w:t xml:space="preserve"> to access its functionality</w:t>
+      </w:r>
+      <w:r>
+        <w:rPr>
+          <w:lang w:val="en-US"/>
+        </w:rPr>
+        <w:t>: a supply / demand form, a resilience form, and an acknowledgements form.</w:t>
+      </w:r>
+      <w:r>
+        <w:rPr>
+          <w:lang w:val="en-US"/>
+        </w:rPr>
+        <w:t xml:space="preserve"> All three forms are accessible from the EwE Navigator </w:t>
+      </w:r>
+      <w:r>
+        <w:rPr>
+          <w:lang w:val="en-US"/>
+        </w:rPr>
+        <w:t xml:space="preserve">master node </w:t>
+      </w:r>
+      <w:r>
+        <w:rPr>
+          <w:lang w:val="en-US"/>
+        </w:rPr>
+        <w:t>“Ecosim &gt; Output &gt; Resilience” (</w:t>
       </w:r>
       <w:r>
         <w:rPr>
@@ -171,7 +177,7 @@
         <w:rPr>
           <w:lang w:val="en-US"/>
         </w:rPr>
-        <w:instrText xml:space="preserve"> REF _Ref394850067 \h </w:instrText>
+        <w:instrText xml:space="preserve"> REF _Ref408772332 \h </w:instrText>
       </w:r>
       <w:r>
         <w:rPr>
@@ -203,25 +209,7 @@
         <w:rPr>
           <w:lang w:val="en-US"/>
         </w:rPr>
-        <w:t>)</w:t>
-      </w:r>
-      <w:r>
-        <w:rPr>
-          <w:lang w:val="en-US"/>
-        </w:rPr>
-        <w:t>. The plug-in user interface is then activated</w:t>
-      </w:r>
-      <w:r>
-        <w:rPr>
-          <w:lang w:val="en-US"/>
-        </w:rPr>
-        <w:t>.</w:t>
-      </w:r>
-      <w:r>
-        <w:rPr>
-          <w:lang w:val="en-US"/>
-        </w:rPr>
-        <w:t xml:space="preserve"> Note that the plug-in will run Ecosim if this has not already been done.</w:t>
+        <w:t>).</w:t>
       </w:r>
     </w:p>
     <w:p>
@@ -230,14 +218,13 @@
       </w:pPr>
       <w:r>
         <w:rPr>
-          <w:noProof/>
-          <w:lang w:eastAsia="en-GB"/>
+          <w:lang w:val="en-US"/>
         </w:rPr>
         <w:drawing>
-          <wp:inline distT="0" distB="0" distL="0" distR="0" wp14:anchorId="06C8A2DF" wp14:editId="4E640BF4">
-            <wp:extent cx="4848225" cy="3895725"/>
+          <wp:inline distT="0" distB="0" distL="0" distR="0" wp14:anchorId="225C814E" wp14:editId="51D9653A">
+            <wp:extent cx="4581525" cy="3438525"/>
             <wp:effectExtent l="0" t="0" r="9525" b="9525"/>
-            <wp:docPr id="2" name="Picture 2"/>
+            <wp:docPr id="1" name="Picture 1"/>
             <wp:cNvGraphicFramePr>
               <a:graphicFrameLocks xmlns:a="http://schemas.openxmlformats.org/drawingml/2006/main" noChangeAspect="1"/>
             </wp:cNvGraphicFramePr>
@@ -257,7 +244,7 @@
                   <pic:spPr>
                     <a:xfrm>
                       <a:off x="0" y="0"/>
-                      <a:ext cx="4848225" cy="3895725"/>
+                      <a:ext cx="4581525" cy="3438525"/>
                     </a:xfrm>
                     <a:prstGeom prst="rect">
                       <a:avLst/>
@@ -273,140 +260,193 @@
     <w:p>
       <w:pPr>
         <w:pStyle w:val="Caption"/>
-      </w:pPr>
-      <w:bookmarkStart w:id="0" w:name="_Ref394850067"/>
+        <w:rPr>
+          <w:lang w:val="en-US"/>
+        </w:rPr>
+      </w:pPr>
+      <w:bookmarkStart w:id="0" w:name="_Ref408772332"/>
       <w:r>
         <w:t xml:space="preserve">Figure </w:t>
       </w:r>
-      <w:r>
+      <w:fldSimple w:instr=" SEQ Figure \* ARABIC ">
+        <w:r>
+          <w:rPr>
+            <w:noProof/>
+          </w:rPr>
+          <w:t>1</w:t>
+        </w:r>
+      </w:fldSimple>
+      <w:bookmarkEnd w:id="0"/>
+      <w:r>
+        <w:t xml:space="preserve"> - Resilience navigation tree nodes</w:t>
+      </w:r>
+    </w:p>
+    <w:p>
+      <w:pPr>
+        <w:pStyle w:val="Heading3"/>
+        <w:rPr>
+          <w:lang w:val="en-US"/>
+        </w:rPr>
+      </w:pPr>
+      <w:r>
+        <w:rPr>
+          <w:lang w:val="en-US"/>
+        </w:rPr>
+        <w:t>Supply and demand</w:t>
+      </w:r>
+    </w:p>
+    <w:p>
+      <w:pPr>
+        <w:rPr>
+          <w:lang w:val="en-US"/>
+        </w:rPr>
+      </w:pPr>
+      <w:r>
+        <w:rPr>
+          <w:lang w:val="en-US"/>
+        </w:rPr>
+        <w:t xml:space="preserve">The </w:t>
+      </w:r>
+      <w:r>
+        <w:rPr>
+          <w:lang w:val="en-US"/>
+        </w:rPr>
+        <w:t xml:space="preserve">supply / </w:t>
+      </w:r>
+      <w:r>
+        <w:rPr>
+          <w:lang w:val="en-US"/>
+        </w:rPr>
+        <w:t>demand form shows the logarithmic values of supply of all producers, and demand of all consumers over time (either annually or monthly), and shows a regression line that portrays resilience.</w:t>
+      </w:r>
+    </w:p>
+    <w:p>
+      <w:pPr>
+        <w:rPr>
+          <w:lang w:val="en-US"/>
+        </w:rPr>
+      </w:pPr>
+      <w:r>
+        <w:rPr>
+          <w:lang w:val="en-US"/>
+        </w:rPr>
+        <w:t xml:space="preserve">To </w:t>
+      </w:r>
+      <w:r>
+        <w:rPr>
+          <w:lang w:val="en-US"/>
+        </w:rPr>
+        <w:t xml:space="preserve">show the </w:t>
+      </w:r>
+      <w:r>
+        <w:rPr>
+          <w:lang w:val="en-US"/>
+        </w:rPr>
+        <w:t>supply / demand</w:t>
+      </w:r>
+      <w:r>
+        <w:rPr>
+          <w:lang w:val="en-US"/>
+        </w:rPr>
+        <w:t xml:space="preserve"> form</w:t>
+      </w:r>
+      <w:r>
+        <w:rPr>
+          <w:lang w:val="en-US"/>
+        </w:rPr>
+        <w:t xml:space="preserve">, navigate to </w:t>
+      </w:r>
+      <w:r>
+        <w:rPr>
+          <w:lang w:val="en-US"/>
+        </w:rPr>
+        <w:t xml:space="preserve">Ecosim &gt; Output &gt; Resilience </w:t>
+      </w:r>
+      <w:r>
+        <w:rPr>
+          <w:lang w:val="en-US"/>
+        </w:rPr>
+        <w:t>&gt; Supply</w:t>
+      </w:r>
+      <w:r>
+        <w:rPr>
+          <w:lang w:val="en-US"/>
+        </w:rPr>
+        <w:t xml:space="preserve"> </w:t>
+      </w:r>
+      <w:r>
+        <w:rPr>
+          <w:lang w:val="en-US"/>
+        </w:rPr>
+        <w:t>/</w:t>
+      </w:r>
+      <w:r>
+        <w:rPr>
+          <w:lang w:val="en-US"/>
+        </w:rPr>
+        <w:t xml:space="preserve"> </w:t>
+      </w:r>
+      <w:r>
+        <w:rPr>
+          <w:lang w:val="en-US"/>
+        </w:rPr>
+        <w:t xml:space="preserve">demand </w:t>
+      </w:r>
+      <w:r>
+        <w:rPr>
+          <w:lang w:val="en-US"/>
+        </w:rPr>
+        <w:t>(</w:t>
+      </w:r>
+      <w:r>
+        <w:rPr>
+          <w:lang w:val="en-US"/>
+        </w:rPr>
         <w:fldChar w:fldCharType="begin"/>
       </w:r>
       <w:r>
-        <w:instrText xml:space="preserve"> SEQ Figure \* ARABIC </w:instrText>
-      </w:r>
-      <w:r>
+        <w:rPr>
+          <w:lang w:val="en-US"/>
+        </w:rPr>
+        <w:instrText xml:space="preserve"> REF _Ref394850067 \h </w:instrText>
+      </w:r>
+      <w:r>
+        <w:rPr>
+          <w:lang w:val="en-US"/>
+        </w:rPr>
+      </w:r>
+      <w:r>
+        <w:rPr>
+          <w:lang w:val="en-US"/>
+        </w:rPr>
         <w:fldChar w:fldCharType="separate"/>
       </w:r>
       <w:r>
+        <w:t xml:space="preserve">Figure </w:t>
+      </w:r>
+      <w:r>
         <w:rPr>
           <w:noProof/>
         </w:rPr>
-        <w:t>1</w:t>
-      </w:r>
-      <w:r>
-        <w:rPr>
-          <w:noProof/>
+        <w:t>2</w:t>
+      </w:r>
+      <w:r>
+        <w:rPr>
+          <w:lang w:val="en-US"/>
         </w:rPr>
         <w:fldChar w:fldCharType="end"/>
       </w:r>
-      <w:bookmarkEnd w:id="0"/>
-      <w:r>
-        <w:t xml:space="preserve"> - Activating auto</w:t>
-      </w:r>
-      <w:r>
-        <w:t xml:space="preserve">matic </w:t>
-      </w:r>
-      <w:r>
-        <w:t>saving of Ecosim consumption matrices</w:t>
-      </w:r>
-    </w:p>
-    <w:p>
-      <w:pPr>
-        <w:rPr>
-          <w:lang w:val="en-US"/>
-        </w:rPr>
-      </w:pPr>
-      <w:r>
-        <w:rPr>
-          <w:lang w:val="en-US"/>
-        </w:rPr>
-        <w:t xml:space="preserve">The </w:t>
-      </w:r>
-      <w:r>
-        <w:rPr>
-          <w:lang w:val="en-US"/>
-        </w:rPr>
-        <w:t xml:space="preserve">Resilience graph is revealed, displaying either monthly or annual resilience trends for the different consumers in the Ecopath model. The time slider can be used to display resilience for different Ecosim time steps (when showing monthly data) or years (when showing annual data). </w:t>
-      </w:r>
-    </w:p>
-    <w:p>
-      <w:pPr>
-        <w:rPr>
-          <w:lang w:val="en-US"/>
-        </w:rPr>
-      </w:pPr>
-      <w:r>
-        <w:rPr>
-          <w:lang w:val="en-US"/>
-        </w:rPr>
-        <w:t>Note that the graph is scaled to the maximum supply and demand values (either monthly or annual) across the Ecosim run.</w:t>
-      </w:r>
-    </w:p>
-    <w:p>
-      <w:pPr>
-        <w:pStyle w:val="Heading2"/>
-      </w:pPr>
-      <w:r>
-        <w:t>Auto-saving</w:t>
-      </w:r>
-    </w:p>
-    <w:p>
-      <w:r>
-        <w:t xml:space="preserve">The Resilience user interface contains the option to turn auto-saving on or off </w:t>
-      </w:r>
-      <w:r>
-        <w:t xml:space="preserve">(see </w:t>
-      </w:r>
-      <w:r>
-        <w:fldChar w:fldCharType="begin"/>
-      </w:r>
-      <w:r>
-        <w:instrText xml:space="preserve"> REF _Ref394850067 \h </w:instrText>
-      </w:r>
-      <w:r>
-        <w:fldChar w:fldCharType="separate"/>
-      </w:r>
-      <w:r>
-        <w:t xml:space="preserve">Figure </w:t>
-      </w:r>
-      <w:r>
-        <w:rPr>
-          <w:noProof/>
-        </w:rPr>
-        <w:t>1</w:t>
-      </w:r>
-      <w:r>
-        <w:fldChar w:fldCharType="end"/>
-      </w:r>
-      <w:r>
+      <w:r>
+        <w:rPr>
+          <w:lang w:val="en-US"/>
+        </w:rPr>
         <w:t>)</w:t>
       </w:r>
       <w:r>
-        <w:t xml:space="preserve">. This option can also be toggled from the EwE file management settings (Tools &gt; Options &gt; File Management, </w:t>
-      </w:r>
-      <w:r>
-        <w:fldChar w:fldCharType="begin"/>
-      </w:r>
-      <w:r>
-        <w:instrText xml:space="preserve"> REF _Ref404333724 \h </w:instrText>
-      </w:r>
-      <w:r>
-        <w:fldChar w:fldCharType="separate"/>
-      </w:r>
-      <w:r>
-        <w:t xml:space="preserve">Figure </w:t>
-      </w:r>
-      <w:r>
-        <w:rPr>
-          <w:noProof/>
-        </w:rPr>
-        <w:t>2</w:t>
-      </w:r>
-      <w:r>
-        <w:fldChar w:fldCharType="end"/>
-      </w:r>
-      <w:r>
-        <w:t>)</w:t>
+        <w:rPr>
+          <w:lang w:val="en-US"/>
+        </w:rPr>
+        <w:t>. Note that the plug-in will run Ecosim if this has not already been done.</w:t>
       </w:r>
     </w:p>
     <w:p>
@@ -420,7 +460,925 @@
         </w:rPr>
         <w:lastRenderedPageBreak/>
         <w:drawing>
-          <wp:inline distT="0" distB="0" distL="0" distR="0" wp14:anchorId="38C3E2A3" wp14:editId="4DDA513E">
+          <wp:inline distT="0" distB="0" distL="0" distR="0" wp14:anchorId="38DBF3F0" wp14:editId="0FA08DF1">
+            <wp:extent cx="4581525" cy="3438525"/>
+            <wp:effectExtent l="0" t="0" r="9525" b="9525"/>
+            <wp:docPr id="3" name="Picture 3"/>
+            <wp:cNvGraphicFramePr>
+              <a:graphicFrameLocks xmlns:a="http://schemas.openxmlformats.org/drawingml/2006/main" noChangeAspect="1"/>
+            </wp:cNvGraphicFramePr>
+            <a:graphic xmlns:a="http://schemas.openxmlformats.org/drawingml/2006/main">
+              <a:graphicData uri="http://schemas.openxmlformats.org/drawingml/2006/picture">
+                <pic:pic xmlns:pic="http://schemas.openxmlformats.org/drawingml/2006/picture">
+                  <pic:nvPicPr>
+                    <pic:cNvPr id="0" name=""/>
+                    <pic:cNvPicPr/>
+                  </pic:nvPicPr>
+                  <pic:blipFill>
+                    <a:blip r:embed="rId8"/>
+                    <a:stretch>
+                      <a:fillRect/>
+                    </a:stretch>
+                  </pic:blipFill>
+                  <pic:spPr>
+                    <a:xfrm>
+                      <a:off x="0" y="0"/>
+                      <a:ext cx="4581525" cy="3438525"/>
+                    </a:xfrm>
+                    <a:prstGeom prst="rect">
+                      <a:avLst/>
+                    </a:prstGeom>
+                  </pic:spPr>
+                </pic:pic>
+              </a:graphicData>
+            </a:graphic>
+          </wp:inline>
+        </w:drawing>
+      </w:r>
+    </w:p>
+    <w:p>
+      <w:pPr>
+        <w:pStyle w:val="Caption"/>
+      </w:pPr>
+      <w:bookmarkStart w:id="1" w:name="_Ref394850067"/>
+      <w:r>
+        <w:t xml:space="preserve">Figure </w:t>
+      </w:r>
+      <w:fldSimple w:instr=" SEQ Figure \* ARABIC ">
+        <w:r>
+          <w:rPr>
+            <w:noProof/>
+          </w:rPr>
+          <w:t>2</w:t>
+        </w:r>
+      </w:fldSimple>
+      <w:bookmarkEnd w:id="1"/>
+      <w:r>
+        <w:t xml:space="preserve"> </w:t>
+      </w:r>
+      <w:r>
+        <w:t>–</w:t>
+      </w:r>
+      <w:r>
+        <w:t xml:space="preserve"> </w:t>
+      </w:r>
+      <w:r>
+        <w:t>The supply / demand form</w:t>
+      </w:r>
+    </w:p>
+    <w:p>
+      <w:pPr>
+        <w:rPr>
+          <w:lang w:val="en-US"/>
+        </w:rPr>
+      </w:pPr>
+      <w:r>
+        <w:rPr>
+          <w:lang w:val="en-US"/>
+        </w:rPr>
+        <w:t xml:space="preserve">The </w:t>
+      </w:r>
+      <w:r>
+        <w:rPr>
+          <w:lang w:val="en-US"/>
+        </w:rPr>
+        <w:t>graph in this form displays</w:t>
+      </w:r>
+      <w:r>
+        <w:rPr>
+          <w:lang w:val="en-US"/>
+        </w:rPr>
+        <w:t xml:space="preserve"> monthly or annual resilience trends for the different consumers in the Ecopath model. The time slider can be used to display resilience for different Ecosim time steps (when showing monthly data) or years (when showing annual data). </w:t>
+      </w:r>
+    </w:p>
+    <w:p>
+      <w:pPr>
+        <w:rPr>
+          <w:lang w:val="en-US"/>
+        </w:rPr>
+      </w:pPr>
+      <w:r>
+        <w:rPr>
+          <w:lang w:val="en-US"/>
+        </w:rPr>
+        <w:t>To change between annual and monthly mode, check or uncheck the “Annual” check box.</w:t>
+      </w:r>
+    </w:p>
+    <w:p>
+      <w:pPr>
+        <w:rPr>
+          <w:lang w:val="en-US"/>
+        </w:rPr>
+      </w:pPr>
+      <w:r>
+        <w:rPr>
+          <w:lang w:val="en-US"/>
+        </w:rPr>
+        <w:t>To see values for a different time move the slider knob to a different value. Note that the current time (either year or Ecosim time step) is reflected to the right of the time slider.</w:t>
+      </w:r>
+    </w:p>
+    <w:p>
+      <w:pPr>
+        <w:rPr>
+          <w:lang w:val="en-US"/>
+        </w:rPr>
+      </w:pPr>
+      <w:r>
+        <w:rPr>
+          <w:lang w:val="en-US"/>
+        </w:rPr>
+        <w:t>The form offers three additional options:</w:t>
+      </w:r>
+    </w:p>
+    <w:p>
+      <w:pPr>
+        <w:pStyle w:val="ListParagraph"/>
+        <w:numPr>
+          <w:ilvl w:val="0"/>
+          <w:numId w:val="2"/>
+        </w:numPr>
+        <w:rPr>
+          <w:lang w:val="en-US"/>
+        </w:rPr>
+      </w:pPr>
+      <w:r>
+        <w:rPr>
+          <w:lang w:val="en-US"/>
+        </w:rPr>
+        <w:t>When the auto-save option is clicked, the plug-in will automatically save computed data to the default Ecosim output location. Saving happens after an Ecosim run. The Ecosim file location can be configured in the EwE File Management Options interface</w:t>
+      </w:r>
+      <w:r>
+        <w:rPr>
+          <w:lang w:val="en-US"/>
+        </w:rPr>
+        <w:t xml:space="preserve"> (see “</w:t>
+      </w:r>
+      <w:r>
+        <w:rPr>
+          <w:lang w:val="en-US"/>
+        </w:rPr>
+        <w:fldChar w:fldCharType="begin"/>
+      </w:r>
+      <w:r>
+        <w:rPr>
+          <w:lang w:val="en-US"/>
+        </w:rPr>
+        <w:instrText xml:space="preserve"> REF _Ref408772928 \h </w:instrText>
+      </w:r>
+      <w:r>
+        <w:rPr>
+          <w:lang w:val="en-US"/>
+        </w:rPr>
+      </w:r>
+      <w:r>
+        <w:rPr>
+          <w:lang w:val="en-US"/>
+        </w:rPr>
+        <w:fldChar w:fldCharType="separate"/>
+      </w:r>
+      <w:r>
+        <w:t>Auto-saving</w:t>
+      </w:r>
+      <w:r>
+        <w:rPr>
+          <w:lang w:val="en-US"/>
+        </w:rPr>
+        <w:fldChar w:fldCharType="end"/>
+      </w:r>
+      <w:r>
+        <w:rPr>
+          <w:lang w:val="en-US"/>
+        </w:rPr>
+        <w:t>”, below)</w:t>
+      </w:r>
+      <w:r>
+        <w:rPr>
+          <w:lang w:val="en-US"/>
+        </w:rPr>
+        <w:t>;</w:t>
+      </w:r>
+    </w:p>
+    <w:p>
+      <w:pPr>
+        <w:pStyle w:val="ListParagraph"/>
+        <w:numPr>
+          <w:ilvl w:val="0"/>
+          <w:numId w:val="2"/>
+        </w:numPr>
+        <w:rPr>
+          <w:lang w:val="en-US"/>
+        </w:rPr>
+      </w:pPr>
+      <w:r>
+        <w:rPr>
+          <w:lang w:val="en-US"/>
+        </w:rPr>
+        <w:t>When the “save now” option is clicked, the plug-in will save computed data immediately to the default Ecosim output location;</w:t>
+      </w:r>
+    </w:p>
+    <w:p>
+      <w:pPr>
+        <w:pStyle w:val="ListParagraph"/>
+        <w:numPr>
+          <w:ilvl w:val="0"/>
+          <w:numId w:val="2"/>
+        </w:numPr>
+        <w:rPr>
+          <w:lang w:val="en-US"/>
+        </w:rPr>
+      </w:pPr>
+      <w:r>
+        <w:rPr>
+          <w:lang w:val="en-US"/>
+        </w:rPr>
+        <w:t>When the “Auto-scale” option is checked, the graph will scale the X and Y axes best fit the computed data for each time step: when sliding across time, axes ranges will vary. When the option is not checked, the graph will scale its X and Y axes to the maximum supply and demand values encountered across the Ecosim run: w</w:t>
+      </w:r>
+      <w:r>
+        <w:rPr>
+          <w:lang w:val="en-US"/>
+        </w:rPr>
+        <w:t xml:space="preserve">hen sliding across time, axes ranges will </w:t>
+      </w:r>
+      <w:r>
+        <w:rPr>
+          <w:lang w:val="en-US"/>
+        </w:rPr>
+        <w:t>remain constant</w:t>
+      </w:r>
+      <w:r>
+        <w:rPr>
+          <w:lang w:val="en-US"/>
+        </w:rPr>
+        <w:t>.</w:t>
+      </w:r>
+    </w:p>
+    <w:p>
+      <w:pPr>
+        <w:pStyle w:val="Heading3"/>
+        <w:rPr>
+          <w:lang w:val="en-US"/>
+        </w:rPr>
+      </w:pPr>
+      <w:r>
+        <w:rPr>
+          <w:lang w:val="en-US"/>
+        </w:rPr>
+        <w:t>Resilience</w:t>
+      </w:r>
+    </w:p>
+    <w:p>
+      <w:pPr>
+        <w:rPr>
+          <w:lang w:val="en-US"/>
+        </w:rPr>
+      </w:pPr>
+      <w:r>
+        <w:rPr>
+          <w:lang w:val="en-US"/>
+        </w:rPr>
+        <w:t xml:space="preserve">The </w:t>
+      </w:r>
+      <w:r>
+        <w:rPr>
+          <w:lang w:val="en-US"/>
+        </w:rPr>
+        <w:t>resilience</w:t>
+      </w:r>
+      <w:r>
+        <w:rPr>
+          <w:lang w:val="en-US"/>
+        </w:rPr>
+        <w:t xml:space="preserve"> form shows </w:t>
+      </w:r>
+      <w:r>
+        <w:rPr>
+          <w:lang w:val="en-US"/>
+        </w:rPr>
+        <w:t>computed</w:t>
+      </w:r>
+      <w:r>
+        <w:rPr>
+          <w:lang w:val="en-US"/>
+        </w:rPr>
+        <w:t xml:space="preserve"> resilience</w:t>
+      </w:r>
+      <w:r>
+        <w:rPr>
+          <w:lang w:val="en-US"/>
+        </w:rPr>
+        <w:t xml:space="preserve"> for all Ecosim time steps and Ecosim years</w:t>
+      </w:r>
+      <w:r>
+        <w:rPr>
+          <w:lang w:val="en-US"/>
+        </w:rPr>
+        <w:t>.</w:t>
+      </w:r>
+    </w:p>
+    <w:p>
+      <w:pPr>
+        <w:rPr>
+          <w:lang w:val="en-US"/>
+        </w:rPr>
+      </w:pPr>
+      <w:r>
+        <w:rPr>
+          <w:lang w:val="en-US"/>
+        </w:rPr>
+        <w:lastRenderedPageBreak/>
+        <w:t xml:space="preserve">To show the </w:t>
+      </w:r>
+      <w:r>
+        <w:rPr>
+          <w:lang w:val="en-US"/>
+        </w:rPr>
+        <w:t xml:space="preserve">resilience </w:t>
+      </w:r>
+      <w:r>
+        <w:rPr>
+          <w:lang w:val="en-US"/>
+        </w:rPr>
+        <w:t xml:space="preserve">form, navigate to Ecosim &gt; Output &gt; Resilience &gt; </w:t>
+      </w:r>
+      <w:r>
+        <w:rPr>
+          <w:lang w:val="en-US"/>
+        </w:rPr>
+        <w:t>Resilience</w:t>
+      </w:r>
+      <w:r>
+        <w:rPr>
+          <w:lang w:val="en-US"/>
+        </w:rPr>
+        <w:t xml:space="preserve"> (</w:t>
+      </w:r>
+      <w:r>
+        <w:rPr>
+          <w:lang w:val="en-US"/>
+        </w:rPr>
+        <w:fldChar w:fldCharType="begin"/>
+      </w:r>
+      <w:r>
+        <w:rPr>
+          <w:lang w:val="en-US"/>
+        </w:rPr>
+        <w:instrText xml:space="preserve"> REF _Ref408773228 \h </w:instrText>
+      </w:r>
+      <w:r>
+        <w:rPr>
+          <w:lang w:val="en-US"/>
+        </w:rPr>
+      </w:r>
+      <w:r>
+        <w:rPr>
+          <w:lang w:val="en-US"/>
+        </w:rPr>
+        <w:fldChar w:fldCharType="separate"/>
+      </w:r>
+      <w:r>
+        <w:t xml:space="preserve">Figure </w:t>
+      </w:r>
+      <w:r>
+        <w:rPr>
+          <w:noProof/>
+        </w:rPr>
+        <w:t>3</w:t>
+      </w:r>
+      <w:r>
+        <w:rPr>
+          <w:lang w:val="en-US"/>
+        </w:rPr>
+        <w:fldChar w:fldCharType="end"/>
+      </w:r>
+      <w:r>
+        <w:rPr>
+          <w:lang w:val="en-US"/>
+        </w:rPr>
+        <w:t>). Note that the plug-in will run Ecosim if this has not already been done</w:t>
+      </w:r>
+      <w:r>
+        <w:rPr>
+          <w:lang w:val="en-US"/>
+        </w:rPr>
+        <w:t>.</w:t>
+      </w:r>
+    </w:p>
+    <w:p>
+      <w:pPr>
+        <w:keepNext/>
+      </w:pPr>
+      <w:r>
+        <w:rPr>
+          <w:noProof/>
+          <w:lang w:eastAsia="en-GB"/>
+        </w:rPr>
+        <w:drawing>
+          <wp:inline distT="0" distB="0" distL="0" distR="0" wp14:anchorId="0D8FBCCE" wp14:editId="5E4AE2EB">
+            <wp:extent cx="4581525" cy="3438525"/>
+            <wp:effectExtent l="0" t="0" r="9525" b="9525"/>
+            <wp:docPr id="4" name="Picture 4"/>
+            <wp:cNvGraphicFramePr>
+              <a:graphicFrameLocks xmlns:a="http://schemas.openxmlformats.org/drawingml/2006/main" noChangeAspect="1"/>
+            </wp:cNvGraphicFramePr>
+            <a:graphic xmlns:a="http://schemas.openxmlformats.org/drawingml/2006/main">
+              <a:graphicData uri="http://schemas.openxmlformats.org/drawingml/2006/picture">
+                <pic:pic xmlns:pic="http://schemas.openxmlformats.org/drawingml/2006/picture">
+                  <pic:nvPicPr>
+                    <pic:cNvPr id="0" name=""/>
+                    <pic:cNvPicPr/>
+                  </pic:nvPicPr>
+                  <pic:blipFill>
+                    <a:blip r:embed="rId9"/>
+                    <a:stretch>
+                      <a:fillRect/>
+                    </a:stretch>
+                  </pic:blipFill>
+                  <pic:spPr>
+                    <a:xfrm>
+                      <a:off x="0" y="0"/>
+                      <a:ext cx="4581525" cy="3438525"/>
+                    </a:xfrm>
+                    <a:prstGeom prst="rect">
+                      <a:avLst/>
+                    </a:prstGeom>
+                  </pic:spPr>
+                </pic:pic>
+              </a:graphicData>
+            </a:graphic>
+          </wp:inline>
+        </w:drawing>
+      </w:r>
+    </w:p>
+    <w:p>
+      <w:pPr>
+        <w:pStyle w:val="Caption"/>
+      </w:pPr>
+      <w:bookmarkStart w:id="2" w:name="_Ref408773228"/>
+      <w:r>
+        <w:t xml:space="preserve">Figure </w:t>
+      </w:r>
+      <w:fldSimple w:instr=" SEQ Figure \* ARABIC ">
+        <w:r>
+          <w:rPr>
+            <w:noProof/>
+          </w:rPr>
+          <w:t>3</w:t>
+        </w:r>
+      </w:fldSimple>
+      <w:bookmarkEnd w:id="2"/>
+      <w:r>
+        <w:t xml:space="preserve"> - The resilience form</w:t>
+      </w:r>
+    </w:p>
+    <w:p>
+      <w:pPr>
+        <w:rPr>
+          <w:lang w:val="en-US"/>
+        </w:rPr>
+      </w:pPr>
+      <w:r>
+        <w:rPr>
+          <w:lang w:val="en-US"/>
+        </w:rPr>
+        <w:t xml:space="preserve">The graph </w:t>
+      </w:r>
+      <w:r>
+        <w:rPr>
+          <w:lang w:val="en-US"/>
+        </w:rPr>
+        <w:t xml:space="preserve">in this form displays both </w:t>
+      </w:r>
+      <w:r>
+        <w:rPr>
+          <w:lang w:val="en-US"/>
+        </w:rPr>
+        <w:t xml:space="preserve">monthly </w:t>
+      </w:r>
+      <w:r>
+        <w:rPr>
+          <w:lang w:val="en-US"/>
+        </w:rPr>
+        <w:t xml:space="preserve">and </w:t>
+      </w:r>
+      <w:r>
+        <w:rPr>
+          <w:lang w:val="en-US"/>
+        </w:rPr>
+        <w:t xml:space="preserve">annual resilience trends </w:t>
+      </w:r>
+      <w:r>
+        <w:rPr>
+          <w:lang w:val="en-US"/>
+        </w:rPr>
+        <w:t>for the Ecosim run. Time step values are depicted by a continuous line. Annual averages are depicted as blue circles.</w:t>
+      </w:r>
+    </w:p>
+    <w:p>
+      <w:pPr>
+        <w:rPr>
+          <w:lang w:val="en-US"/>
+        </w:rPr>
+      </w:pPr>
+      <w:r>
+        <w:rPr>
+          <w:lang w:val="en-US"/>
+        </w:rPr>
+        <w:t xml:space="preserve">The form offers </w:t>
+      </w:r>
+      <w:r>
+        <w:rPr>
+          <w:lang w:val="en-US"/>
+        </w:rPr>
+        <w:t>two</w:t>
+      </w:r>
+      <w:r>
+        <w:rPr>
+          <w:lang w:val="en-US"/>
+        </w:rPr>
+        <w:t xml:space="preserve"> additional options:</w:t>
+      </w:r>
+    </w:p>
+    <w:p>
+      <w:pPr>
+        <w:pStyle w:val="ListParagraph"/>
+        <w:numPr>
+          <w:ilvl w:val="0"/>
+          <w:numId w:val="2"/>
+        </w:numPr>
+        <w:rPr>
+          <w:lang w:val="en-US"/>
+        </w:rPr>
+      </w:pPr>
+      <w:r>
+        <w:rPr>
+          <w:lang w:val="en-US"/>
+        </w:rPr>
+        <w:t>When the auto-save option is clicked, the plug-in will automatically save computed data to the default Ecosim output location. Saving happens after an Ecosim run. The Ecosim file location can be configured in the EwE File Management Options interface (see “</w:t>
+      </w:r>
+      <w:r>
+        <w:rPr>
+          <w:lang w:val="en-US"/>
+        </w:rPr>
+        <w:fldChar w:fldCharType="begin"/>
+      </w:r>
+      <w:r>
+        <w:rPr>
+          <w:lang w:val="en-US"/>
+        </w:rPr>
+        <w:instrText xml:space="preserve"> REF _Ref408772928 \h </w:instrText>
+      </w:r>
+      <w:r>
+        <w:rPr>
+          <w:lang w:val="en-US"/>
+        </w:rPr>
+      </w:r>
+      <w:r>
+        <w:rPr>
+          <w:lang w:val="en-US"/>
+        </w:rPr>
+        <w:fldChar w:fldCharType="separate"/>
+      </w:r>
+      <w:r>
+        <w:t>Auto-saving</w:t>
+      </w:r>
+      <w:r>
+        <w:rPr>
+          <w:lang w:val="en-US"/>
+        </w:rPr>
+        <w:fldChar w:fldCharType="end"/>
+      </w:r>
+      <w:r>
+        <w:rPr>
+          <w:lang w:val="en-US"/>
+        </w:rPr>
+        <w:t>”, below);</w:t>
+      </w:r>
+    </w:p>
+    <w:p>
+      <w:pPr>
+        <w:pStyle w:val="ListParagraph"/>
+        <w:numPr>
+          <w:ilvl w:val="0"/>
+          <w:numId w:val="2"/>
+        </w:numPr>
+        <w:rPr>
+          <w:lang w:val="en-US"/>
+        </w:rPr>
+      </w:pPr>
+      <w:r>
+        <w:rPr>
+          <w:lang w:val="en-US"/>
+        </w:rPr>
+        <w:t>When the “save now” option is clicked, the plug-in will save computed data immediately to the default Ecosim output location;</w:t>
+      </w:r>
+    </w:p>
+    <w:p>
+      <w:pPr>
+        <w:pStyle w:val="Heading3"/>
+        <w:rPr>
+          <w:lang w:val="en-US"/>
+        </w:rPr>
+      </w:pPr>
+      <w:r>
+        <w:rPr>
+          <w:lang w:val="en-US"/>
+        </w:rPr>
+        <w:t>Acknowledgements</w:t>
+      </w:r>
+    </w:p>
+    <w:p>
+      <w:pPr>
+        <w:rPr>
+          <w:lang w:val="en-US"/>
+        </w:rPr>
+      </w:pPr>
+      <w:r>
+        <w:rPr>
+          <w:lang w:val="en-US"/>
+        </w:rPr>
+        <w:t xml:space="preserve">The </w:t>
+      </w:r>
+      <w:r>
+        <w:rPr>
+          <w:lang w:val="en-US"/>
+        </w:rPr>
+        <w:t>acknowledgements</w:t>
+      </w:r>
+      <w:r>
+        <w:rPr>
+          <w:lang w:val="en-US"/>
+        </w:rPr>
+        <w:t xml:space="preserve"> form shows </w:t>
+      </w:r>
+      <w:r>
+        <w:rPr>
+          <w:lang w:val="en-US"/>
+        </w:rPr>
+        <w:t>credits, references, sponsor information and a support link for the plug-in.</w:t>
+      </w:r>
+    </w:p>
+    <w:p>
+      <w:pPr>
+        <w:rPr>
+          <w:lang w:val="en-US"/>
+        </w:rPr>
+      </w:pPr>
+      <w:r>
+        <w:rPr>
+          <w:lang w:val="en-US"/>
+        </w:rPr>
+        <w:t xml:space="preserve">To show the </w:t>
+      </w:r>
+      <w:r>
+        <w:rPr>
+          <w:lang w:val="en-US"/>
+        </w:rPr>
+        <w:t xml:space="preserve">acknowledgements </w:t>
+      </w:r>
+      <w:r>
+        <w:rPr>
+          <w:lang w:val="en-US"/>
+        </w:rPr>
+        <w:t xml:space="preserve">form, navigate to Ecosim &gt; Output &gt; Resilience &gt; </w:t>
+      </w:r>
+      <w:r>
+        <w:rPr>
+          <w:lang w:val="en-US"/>
+        </w:rPr>
+        <w:t xml:space="preserve">Resilience acknowledgements </w:t>
+      </w:r>
+      <w:r>
+        <w:rPr>
+          <w:lang w:val="en-US"/>
+        </w:rPr>
+        <w:t>(</w:t>
+      </w:r>
+      <w:r>
+        <w:rPr>
+          <w:lang w:val="en-US"/>
+        </w:rPr>
+        <w:fldChar w:fldCharType="begin"/>
+      </w:r>
+      <w:r>
+        <w:rPr>
+          <w:lang w:val="en-US"/>
+        </w:rPr>
+        <w:instrText xml:space="preserve"> REF _Ref408773612 \h </w:instrText>
+      </w:r>
+      <w:r>
+        <w:rPr>
+          <w:lang w:val="en-US"/>
+        </w:rPr>
+      </w:r>
+      <w:r>
+        <w:rPr>
+          <w:lang w:val="en-US"/>
+        </w:rPr>
+        <w:fldChar w:fldCharType="separate"/>
+      </w:r>
+      <w:r>
+        <w:t xml:space="preserve">Figure </w:t>
+      </w:r>
+      <w:r>
+        <w:rPr>
+          <w:noProof/>
+        </w:rPr>
+        <w:t>4</w:t>
+      </w:r>
+      <w:r>
+        <w:rPr>
+          <w:lang w:val="en-US"/>
+        </w:rPr>
+        <w:fldChar w:fldCharType="end"/>
+      </w:r>
+      <w:r>
+        <w:rPr>
+          <w:lang w:val="en-US"/>
+        </w:rPr>
+        <w:t xml:space="preserve">). </w:t>
+      </w:r>
+    </w:p>
+    <w:p>
+      <w:pPr>
+        <w:rPr>
+          <w:lang w:val="en-US"/>
+        </w:rPr>
+      </w:pPr>
+    </w:p>
+    <w:p>
+      <w:pPr>
+        <w:keepNext/>
+      </w:pPr>
+      <w:r>
+        <w:rPr>
+          <w:noProof/>
+          <w:lang w:eastAsia="en-GB"/>
+        </w:rPr>
+        <w:lastRenderedPageBreak/>
+        <w:drawing>
+          <wp:inline distT="0" distB="0" distL="0" distR="0" wp14:anchorId="5BA1224A" wp14:editId="4FAD4ACC">
+            <wp:extent cx="4581525" cy="3438525"/>
+            <wp:effectExtent l="0" t="0" r="9525" b="9525"/>
+            <wp:docPr id="6" name="Picture 6"/>
+            <wp:cNvGraphicFramePr>
+              <a:graphicFrameLocks xmlns:a="http://schemas.openxmlformats.org/drawingml/2006/main" noChangeAspect="1"/>
+            </wp:cNvGraphicFramePr>
+            <a:graphic xmlns:a="http://schemas.openxmlformats.org/drawingml/2006/main">
+              <a:graphicData uri="http://schemas.openxmlformats.org/drawingml/2006/picture">
+                <pic:pic xmlns:pic="http://schemas.openxmlformats.org/drawingml/2006/picture">
+                  <pic:nvPicPr>
+                    <pic:cNvPr id="0" name=""/>
+                    <pic:cNvPicPr/>
+                  </pic:nvPicPr>
+                  <pic:blipFill>
+                    <a:blip r:embed="rId10"/>
+                    <a:stretch>
+                      <a:fillRect/>
+                    </a:stretch>
+                  </pic:blipFill>
+                  <pic:spPr>
+                    <a:xfrm>
+                      <a:off x="0" y="0"/>
+                      <a:ext cx="4581525" cy="3438525"/>
+                    </a:xfrm>
+                    <a:prstGeom prst="rect">
+                      <a:avLst/>
+                    </a:prstGeom>
+                  </pic:spPr>
+                </pic:pic>
+              </a:graphicData>
+            </a:graphic>
+          </wp:inline>
+        </w:drawing>
+      </w:r>
+    </w:p>
+    <w:p>
+      <w:pPr>
+        <w:pStyle w:val="Caption"/>
+      </w:pPr>
+      <w:bookmarkStart w:id="3" w:name="_Ref408773612"/>
+      <w:r>
+        <w:t xml:space="preserve">Figure </w:t>
+      </w:r>
+      <w:fldSimple w:instr=" SEQ Figure \* ARABIC ">
+        <w:r>
+          <w:rPr>
+            <w:noProof/>
+          </w:rPr>
+          <w:t>4</w:t>
+        </w:r>
+      </w:fldSimple>
+      <w:bookmarkEnd w:id="3"/>
+      <w:r>
+        <w:t xml:space="preserve"> - The acknowledgements form</w:t>
+      </w:r>
+    </w:p>
+    <w:p>
+      <w:pPr>
+        <w:rPr>
+          <w:lang w:val="en-US"/>
+        </w:rPr>
+      </w:pPr>
+      <w:r>
+        <w:rPr>
+          <w:lang w:val="en-US"/>
+        </w:rPr>
+        <w:t>Clicking the logos will direct users to the website of each institute.</w:t>
+      </w:r>
+    </w:p>
+    <w:p>
+      <w:pPr>
+        <w:rPr>
+          <w:lang w:val="en-US"/>
+        </w:rPr>
+      </w:pPr>
+      <w:r>
+        <w:rPr>
+          <w:lang w:val="en-US"/>
+        </w:rPr>
+        <w:t xml:space="preserve">Clicking the support email address will attempt to launch the default mail client on the Windows machine, and will attempt to start a new email to the contact </w:t>
+      </w:r>
+      <w:bookmarkStart w:id="4" w:name="_GoBack"/>
+      <w:r>
+        <w:rPr>
+          <w:lang w:val="en-US"/>
+        </w:rPr>
+        <w:t>address</w:t>
+      </w:r>
+      <w:bookmarkEnd w:id="4"/>
+      <w:r>
+        <w:rPr>
+          <w:lang w:val="en-US"/>
+        </w:rPr>
+        <w:t>.</w:t>
+      </w:r>
+    </w:p>
+    <w:p>
+      <w:pPr>
+        <w:pStyle w:val="Heading2"/>
+      </w:pPr>
+      <w:bookmarkStart w:id="5" w:name="_Ref408772928"/>
+      <w:r>
+        <w:t>Auto-saving</w:t>
+      </w:r>
+      <w:bookmarkEnd w:id="5"/>
+    </w:p>
+    <w:p>
+      <w:r>
+        <w:t xml:space="preserve">The Resilience </w:t>
+      </w:r>
+      <w:r>
+        <w:t>can be set to automatically save its data to file</w:t>
+      </w:r>
+      <w:r>
+        <w:t xml:space="preserve">. This option can also be </w:t>
+      </w:r>
+      <w:r>
+        <w:t xml:space="preserve">controlled </w:t>
+      </w:r>
+      <w:r>
+        <w:t xml:space="preserve">from the EwE file management settings (Tools &gt; Options &gt; File Management, </w:t>
+      </w:r>
+      <w:r>
+        <w:fldChar w:fldCharType="begin"/>
+      </w:r>
+      <w:r>
+        <w:instrText xml:space="preserve"> REF _Ref404333724 \h </w:instrText>
+      </w:r>
+      <w:r>
+        <w:fldChar w:fldCharType="separate"/>
+      </w:r>
+      <w:r>
+        <w:t xml:space="preserve">Figure </w:t>
+      </w:r>
+      <w:r>
+        <w:rPr>
+          <w:noProof/>
+        </w:rPr>
+        <w:t>2</w:t>
+      </w:r>
+      <w:r>
+        <w:fldChar w:fldCharType="end"/>
+      </w:r>
+      <w:r>
+        <w:t>)</w:t>
+      </w:r>
+      <w:r>
+        <w:t>, where users can also configure where Ecosim will write its data to.</w:t>
+      </w:r>
+    </w:p>
+    <w:p>
+      <w:pPr>
+        <w:keepNext/>
+      </w:pPr>
+      <w:r>
+        <w:rPr>
+          <w:noProof/>
+          <w:lang w:eastAsia="en-GB"/>
+        </w:rPr>
+        <w:lastRenderedPageBreak/>
+        <w:drawing>
+          <wp:inline distT="0" distB="0" distL="0" distR="0" wp14:anchorId="40409A96" wp14:editId="097731A8">
             <wp:extent cx="4638675" cy="3124200"/>
             <wp:effectExtent l="0" t="0" r="9525" b="0"/>
             <wp:docPr id="5" name="Picture 5"/>
@@ -437,7 +1395,7 @@
                     </pic:cNvPicPr>
                   </pic:nvPicPr>
                   <pic:blipFill>
-                    <a:blip r:embed="rId8">
+                    <a:blip r:embed="rId11">
                       <a:extLst>
                         <a:ext uri="{28A0092B-C50C-407E-A947-70E740481C1C}">
                           <a14:useLocalDpi xmlns:a14="http://schemas.microsoft.com/office/drawing/2010/main" val="0"/>
@@ -473,19 +1431,32 @@
       <w:pPr>
         <w:pStyle w:val="Caption"/>
       </w:pPr>
-      <w:bookmarkStart w:id="1" w:name="_Ref404333724"/>
+      <w:bookmarkStart w:id="6" w:name="_Ref404333724"/>
       <w:r>
         <w:t xml:space="preserve">Figure </w:t>
       </w:r>
-      <w:fldSimple w:instr=" SEQ Figure \* ARABIC ">
-        <w:r>
-          <w:rPr>
-            <w:noProof/>
-          </w:rPr>
-          <w:t>2</w:t>
-        </w:r>
-      </w:fldSimple>
-      <w:bookmarkEnd w:id="1"/>
+      <w:r>
+        <w:fldChar w:fldCharType="begin"/>
+      </w:r>
+      <w:r>
+        <w:instrText xml:space="preserve"> SEQ Figure \* ARABIC </w:instrText>
+      </w:r>
+      <w:r>
+        <w:fldChar w:fldCharType="separate"/>
+      </w:r>
+      <w:r>
+        <w:rPr>
+          <w:noProof/>
+        </w:rPr>
+        <w:t>5</w:t>
+      </w:r>
+      <w:r>
+        <w:rPr>
+          <w:noProof/>
+        </w:rPr>
+        <w:fldChar w:fldCharType="end"/>
+      </w:r>
+      <w:bookmarkEnd w:id="6"/>
       <w:r>
         <w:t xml:space="preserve"> - Activating the resilience auto-save option</w:t>
       </w:r>
@@ -550,7 +1521,7 @@
           <w:lang w:eastAsia="en-GB"/>
         </w:rPr>
         <w:drawing>
-          <wp:inline distT="0" distB="0" distL="0" distR="0">
+          <wp:inline distT="0" distB="0" distL="0" distR="0" wp14:anchorId="3CB8A03F" wp14:editId="11E85CCB">
             <wp:extent cx="4857750" cy="1533525"/>
             <wp:effectExtent l="0" t="0" r="0" b="9525"/>
             <wp:docPr id="7" name="Picture 7"/>
@@ -567,7 +1538,7 @@
                     </pic:cNvPicPr>
                   </pic:nvPicPr>
                   <pic:blipFill>
-                    <a:blip r:embed="rId9">
+                    <a:blip r:embed="rId12">
                       <a:extLst>
                         <a:ext uri="{28A0092B-C50C-407E-A947-70E740481C1C}">
                           <a14:useLocalDpi xmlns:a14="http://schemas.microsoft.com/office/drawing/2010/main" val="0"/>
@@ -603,32 +1574,19 @@
       <w:pPr>
         <w:pStyle w:val="Caption"/>
       </w:pPr>
-      <w:bookmarkStart w:id="2" w:name="_Ref394929539"/>
+      <w:bookmarkStart w:id="7" w:name="_Ref394929539"/>
       <w:r>
         <w:t xml:space="preserve">Figure </w:t>
       </w:r>
-      <w:r>
-        <w:fldChar w:fldCharType="begin"/>
-      </w:r>
-      <w:r>
-        <w:instrText xml:space="preserve"> SEQ Figure \* ARABIC </w:instrText>
-      </w:r>
-      <w:r>
-        <w:fldChar w:fldCharType="separate"/>
-      </w:r>
-      <w:r>
-        <w:rPr>
-          <w:noProof/>
-        </w:rPr>
-        <w:t>3</w:t>
-      </w:r>
-      <w:r>
-        <w:rPr>
-          <w:noProof/>
-        </w:rPr>
-        <w:fldChar w:fldCharType="end"/>
-      </w:r>
-      <w:bookmarkEnd w:id="2"/>
+      <w:fldSimple w:instr=" SEQ Figure \* ARABIC ">
+        <w:r>
+          <w:rPr>
+            <w:noProof/>
+          </w:rPr>
+          <w:t>6</w:t>
+        </w:r>
+      </w:fldSimple>
+      <w:bookmarkEnd w:id="7"/>
       <w:r>
         <w:t xml:space="preserve"> - The status panel provides information where data has been saved</w:t>
       </w:r>
@@ -851,12 +1809,7 @@
         <w:t xml:space="preserve">turned off in the </w:t>
       </w:r>
       <w:r>
-        <w:t>auto-sa</w:t>
-      </w:r>
-      <w:bookmarkStart w:id="3" w:name="_GoBack"/>
-      <w:bookmarkEnd w:id="3"/>
-      <w:r>
-        <w:t xml:space="preserve">ve settings (see </w:t>
+        <w:t xml:space="preserve">auto-save settings (see </w:t>
       </w:r>
       <w:r>
         <w:fldChar w:fldCharType="begin"/>
@@ -1096,8 +2049,124 @@
       </w:rPr>
     </w:lvl>
   </w:abstractNum>
+  <w:abstractNum w:abstractNumId="1">
+    <w:nsid w:val="584B7947"/>
+    <w:multiLevelType w:val="hybridMultilevel"/>
+    <w:tmpl w:val="BC70C0E2"/>
+    <w:lvl w:ilvl="0" w:tplc="08090001">
+      <w:start w:val="1"/>
+      <w:numFmt w:val="bullet"/>
+      <w:lvlText w:val=""/>
+      <w:lvlJc w:val="left"/>
+      <w:pPr>
+        <w:ind w:left="720" w:hanging="360"/>
+      </w:pPr>
+      <w:rPr>
+        <w:rFonts w:ascii="Symbol" w:hAnsi="Symbol" w:hint="default"/>
+      </w:rPr>
+    </w:lvl>
+    <w:lvl w:ilvl="1" w:tplc="08090003" w:tentative="1">
+      <w:start w:val="1"/>
+      <w:numFmt w:val="bullet"/>
+      <w:lvlText w:val="o"/>
+      <w:lvlJc w:val="left"/>
+      <w:pPr>
+        <w:ind w:left="1440" w:hanging="360"/>
+      </w:pPr>
+      <w:rPr>
+        <w:rFonts w:ascii="Courier New" w:hAnsi="Courier New" w:cs="Courier New" w:hint="default"/>
+      </w:rPr>
+    </w:lvl>
+    <w:lvl w:ilvl="2" w:tplc="08090005" w:tentative="1">
+      <w:start w:val="1"/>
+      <w:numFmt w:val="bullet"/>
+      <w:lvlText w:val=""/>
+      <w:lvlJc w:val="left"/>
+      <w:pPr>
+        <w:ind w:left="2160" w:hanging="360"/>
+      </w:pPr>
+      <w:rPr>
+        <w:rFonts w:ascii="Wingdings" w:hAnsi="Wingdings" w:hint="default"/>
+      </w:rPr>
+    </w:lvl>
+    <w:lvl w:ilvl="3" w:tplc="08090001" w:tentative="1">
+      <w:start w:val="1"/>
+      <w:numFmt w:val="bullet"/>
+      <w:lvlText w:val=""/>
+      <w:lvlJc w:val="left"/>
+      <w:pPr>
+        <w:ind w:left="2880" w:hanging="360"/>
+      </w:pPr>
+      <w:rPr>
+        <w:rFonts w:ascii="Symbol" w:hAnsi="Symbol" w:hint="default"/>
+      </w:rPr>
+    </w:lvl>
+    <w:lvl w:ilvl="4" w:tplc="08090003" w:tentative="1">
+      <w:start w:val="1"/>
+      <w:numFmt w:val="bullet"/>
+      <w:lvlText w:val="o"/>
+      <w:lvlJc w:val="left"/>
+      <w:pPr>
+        <w:ind w:left="3600" w:hanging="360"/>
+      </w:pPr>
+      <w:rPr>
+        <w:rFonts w:ascii="Courier New" w:hAnsi="Courier New" w:cs="Courier New" w:hint="default"/>
+      </w:rPr>
+    </w:lvl>
+    <w:lvl w:ilvl="5" w:tplc="08090005" w:tentative="1">
+      <w:start w:val="1"/>
+      <w:numFmt w:val="bullet"/>
+      <w:lvlText w:val=""/>
+      <w:lvlJc w:val="left"/>
+      <w:pPr>
+        <w:ind w:left="4320" w:hanging="360"/>
+      </w:pPr>
+      <w:rPr>
+        <w:rFonts w:ascii="Wingdings" w:hAnsi="Wingdings" w:hint="default"/>
+      </w:rPr>
+    </w:lvl>
+    <w:lvl w:ilvl="6" w:tplc="08090001" w:tentative="1">
+      <w:start w:val="1"/>
+      <w:numFmt w:val="bullet"/>
+      <w:lvlText w:val=""/>
+      <w:lvlJc w:val="left"/>
+      <w:pPr>
+        <w:ind w:left="5040" w:hanging="360"/>
+      </w:pPr>
+      <w:rPr>
+        <w:rFonts w:ascii="Symbol" w:hAnsi="Symbol" w:hint="default"/>
+      </w:rPr>
+    </w:lvl>
+    <w:lvl w:ilvl="7" w:tplc="08090003" w:tentative="1">
+      <w:start w:val="1"/>
+      <w:numFmt w:val="bullet"/>
+      <w:lvlText w:val="o"/>
+      <w:lvlJc w:val="left"/>
+      <w:pPr>
+        <w:ind w:left="5760" w:hanging="360"/>
+      </w:pPr>
+      <w:rPr>
+        <w:rFonts w:ascii="Courier New" w:hAnsi="Courier New" w:cs="Courier New" w:hint="default"/>
+      </w:rPr>
+    </w:lvl>
+    <w:lvl w:ilvl="8" w:tplc="08090005" w:tentative="1">
+      <w:start w:val="1"/>
+      <w:numFmt w:val="bullet"/>
+      <w:lvlText w:val=""/>
+      <w:lvlJc w:val="left"/>
+      <w:pPr>
+        <w:ind w:left="6480" w:hanging="360"/>
+      </w:pPr>
+      <w:rPr>
+        <w:rFonts w:ascii="Wingdings" w:hAnsi="Wingdings" w:hint="default"/>
+      </w:rPr>
+    </w:lvl>
+  </w:abstractNum>
   <w:num w:numId="1">
     <w:abstractNumId w:val="0"/>
+  </w:num>
+  <w:num w:numId="2">
+    <w:abstractNumId w:val="1"/>
   </w:num>
 </w:numbering>
 </file>
@@ -2116,7 +3185,7 @@
 </file>
 
 <file path=customXml/itemProps1.xml><?xml version="1.0" encoding="utf-8"?>
-<ds:datastoreItem xmlns:ds="http://schemas.openxmlformats.org/officeDocument/2006/customXml" ds:itemID="{EFCA19C3-49A2-4FFD-8351-096EE61A2FED}">
+<ds:datastoreItem xmlns:ds="http://schemas.openxmlformats.org/officeDocument/2006/customXml" ds:itemID="{5A327B90-E701-45B4-94DC-BBBEF5D0AFDE}">
   <ds:schemaRefs>
     <ds:schemaRef ds:uri="http://schemas.openxmlformats.org/officeDocument/2006/bibliography"/>
   </ds:schemaRefs>

</xml_diff>